<commit_message>
Reorganize n8n canvas and document the workflow in detail
- Reflow workflow nodes into five readable left-to-right stages with
  sticky notes explaining each stage, for presenting on the canvas
- Add a detailed, node-by-node explanation of the n8n workflow to the
  README and the use-case docx, and remove remaining em/en dashes from
  the docx
</commit_message>
<xml_diff>
--- a/docs/LP_Reporting_Assistant_Use_Case.docx
+++ b/docs/LP_Reporting_Assistant_Use_Case.docx
@@ -43,7 +43,7 @@
           <w:sz w:val="22"/>
           <w:szCs w:val="22"/>
         </w:rPr>
-        <w:t xml:space="preserve">AI Deployment  —  Use-Case Report</w:t>
+        <w:t xml:space="preserve">AI Deployment: Use-Case Report</w:t>
       </w:r>
     </w:p>
     <w:p>
@@ -140,7 +140,7 @@
           <w:sz w:val="24"/>
           <w:szCs w:val="24"/>
         </w:rPr>
-        <w:t xml:space="preserve">The LP Reporting Assistant is a working prototype that automates the first draft of this process end to end. An investor uploads each portfolio company’s raw quarterly report; the tool reads it, extracts the key metrics and trends, drafts a concise update paragraph, flags anomalies that warrant attention, and compiles everything into a single branded quarterly report built on Keensight’s own template — a cover page and firm introduction, followed by one clean page per company with tables, charts, and colour-coded status indicators.</w:t>
+        <w:t xml:space="preserve">The LP Reporting Assistant is a working prototype that automates the first draft of this process end to end. An investor uploads each portfolio company’s raw quarterly report; the tool reads it, extracts the key metrics and trends, drafts a concise update paragraph, flags anomalies that warrant attention, and compiles everything into a single branded quarterly report built on Keensight’s own template: a cover page and firm introduction, followed by one clean page per company with tables, charts, and colour-coded status indicators.</w:t>
       </w:r>
     </w:p>
     <w:p>
@@ -206,7 +206,7 @@
           <w:sz w:val="24"/>
           <w:szCs w:val="24"/>
         </w:rPr>
-        <w:t xml:space="preserve">Private equity and growth-equity firms raise capital from institutional investors — pension funds, insurers, endowments, sovereign wealth funds, and family offices. These investors are the firm’s Limited Partners. In exchange for their capital and their trust, they expect regular, transparent, accurate reporting on how the fund and its underlying investments are performing.</w:t>
+        <w:t xml:space="preserve">Private equity and growth-equity firms raise capital from institutional investors, pension funds, insurers, endowments, sovereign wealth funds, and family offices. These investors are the firm’s Limited Partners. In exchange for their capital and their trust, they expect regular, transparent, accurate reporting on how the fund and its underlying investments are performing.</w:t>
       </w:r>
     </w:p>
     <w:p>
@@ -220,7 +220,7 @@
           <w:sz w:val="24"/>
           <w:szCs w:val="24"/>
         </w:rPr>
-        <w:t xml:space="preserve">A central part of that obligation is the quarterly portfolio update. For each company the fund owns, the LP wants to understand: how did revenue and profitability move this quarter and versus a year ago? Is growth accelerating or slowing? What happened operationally — a major new customer, an acquisition, a product delay, a margin squeeze? Institutional investors read these updates carefully; the quality and consistency of reporting is part of how a firm earns the right to raise its next fund.</w:t>
+        <w:t xml:space="preserve">A central part of that obligation is the quarterly portfolio update. For each company the fund owns, the LP wants to understand: how did revenue and profitability move this quarter and versus a year ago? Is growth accelerating or slowing? What happened operationally: a major new customer, an acquisition, a product delay, a margin squeeze? Institutional investors read these updates carefully; the quality and consistency of reporting is part of how a firm earns the right to raise its next fund.</w:t>
       </w:r>
     </w:p>
     <w:p>
@@ -321,7 +321,7 @@
           <w:sz w:val="24"/>
           <w:szCs w:val="24"/>
         </w:rPr>
-        <w:t xml:space="preserve">The same person then writes a short, neutral, professional paragraph for each company — factual, free of hype, and consistent in tone with every other company in the report.</w:t>
+        <w:t xml:space="preserve">The same person then writes a short, neutral, professional paragraph for each company, factual, free of hype, and consistent in tone with every other company in the report.</w:t>
       </w:r>
     </w:p>
     <w:p>
@@ -555,7 +555,7 @@
           <w:sz w:val="24"/>
           <w:szCs w:val="24"/>
         </w:rPr>
-        <w:t xml:space="preserve">It applies clear rules — for example, growth slowing below a threshold, a meaningful margin decline, or an explicitly mentioned delay — and surfaces these as items to watch rather than hiding them.</w:t>
+        <w:t xml:space="preserve">It applies clear rules, for example growth slowing below a threshold, a meaningful margin decline, or an explicitly mentioned delay, and surfaces these as items to watch rather than hiding them.</w:t>
       </w:r>
     </w:p>
     <w:p>
@@ -614,7 +614,7 @@
           <w:sz w:val="24"/>
           <w:szCs w:val="24"/>
         </w:rPr>
-        <w:t xml:space="preserve">It does not send anything to investors. It does not decide what should or should not be disclosed. It does not make investment judgements. It produces a draft; a person reviews and approves it. This boundary is not an afterthought — it is the core design principle, reflected in how each step is built and instructed.</w:t>
+        <w:t xml:space="preserve">It does not send anything to investors. It does not decide what should or should not be disclosed. It does not make investment judgements. It produces a draft; a person reviews and approves it. This boundary is not an afterthought: it is the core design principle, reflected in how each step is built and instructed.</w:t>
       </w:r>
     </w:p>
     <w:p>
@@ -645,7 +645,7 @@
           <w:sz w:val="24"/>
           <w:szCs w:val="24"/>
         </w:rPr>
-        <w:t xml:space="preserve">The finished product is a single Google Doc per quarter, built on Keensight’s real investor-report template. The cover and firm introduction (pages one and two) come through exactly as designed. Each subsequent page presents one portfolio company with a reviewed narrative, a key-metrics table, revenue and margin trend charts, a revenue-by-segment chart, and a watch-items table whose status column is colour-coded — green for on track, amber for monitor, red for attention — so that anything requiring scrutiny is immediately visible.</w:t>
+        <w:t xml:space="preserve">The finished product is a single Google Doc per quarter, built on Keensight’s real investor-report template. The cover and firm introduction (pages one and two) come through exactly as designed. Each subsequent page presents one portfolio company with a reviewed narrative, a key-metrics table, revenue and margin trend charts, a revenue-by-segment chart, and a watch-items table whose status column is colour-coded, green for on track, amber for monitor, red for attention, so that anything requiring scrutiny is immediately visible.</w:t>
       </w:r>
     </w:p>
     <w:p>
@@ -680,7 +680,7 @@
           <w:sz w:val="24"/>
           <w:szCs w:val="24"/>
         </w:rPr>
-        <w:t xml:space="preserve">When a report is submitted — either uploaded through the web application or picked up by the automation directly — it passes through a sequence of clearly defined stages. Each stage does one job and hands its result to the next.</w:t>
+        <w:t xml:space="preserve">When a report is submitted, either uploaded through the web application or picked up by the automation directly, it passes through a sequence of clearly defined stages. Each stage does one job and hands its result to the next.</w:t>
       </w:r>
     </w:p>
     <w:p>
@@ -753,7 +753,7 @@
           <w:sz w:val="24"/>
           <w:szCs w:val="24"/>
         </w:rPr>
-        <w:t xml:space="preserve">The PDF is converted to plain text — a fast, essentially free step that makes every later stage cheaper and more reliable than sending an image to an AI model.</w:t>
+        <w:t xml:space="preserve">The PDF is converted to plain text, a fast, essentially free step that makes every later stage cheaper and more reliable than sending an image to an AI model.</w:t>
       </w:r>
     </w:p>
     <w:p>
@@ -809,7 +809,7 @@
           <w:sz w:val="24"/>
           <w:szCs w:val="24"/>
         </w:rPr>
-        <w:t xml:space="preserve">An AI model reads the full report and returns a structured result — a draft paragraph, the key metrics, the multi-quarter trends, the segment breakdown, and a set of watch items — explicitly flagging anything unusual.</w:t>
+        <w:t xml:space="preserve">An AI model reads the full report and returns a structured result: a draft paragraph, the key metrics, the multi-quarter trends, the segment breakdown, and a set of watch items, explicitly flagging anything unusual.</w:t>
       </w:r>
     </w:p>
     <w:p>
@@ -865,7 +865,7 @@
           <w:sz w:val="24"/>
           <w:szCs w:val="24"/>
         </w:rPr>
-        <w:t xml:space="preserve">The tool copies the Keensight template, then writes the company section — narrative, metrics table, charts, and colour-coded watch items — in the firm’s Inter typeface, matching the template exactly.</w:t>
+        <w:t xml:space="preserve">The tool copies the Keensight template, then writes the company section: narrative, metrics table, charts, and colour-coded watch items, in the firm’s Inter typeface, matching the template exactly.</w:t>
       </w:r>
     </w:p>
     <w:p>
@@ -924,7 +924,7 @@
           <w:sz w:val="24"/>
           <w:szCs w:val="24"/>
         </w:rPr>
-        <w:t xml:space="preserve">Separating drafting from review mirrors how good writing is actually produced, and it makes the system more controllable. The first pass is asked to be thorough and to surface everything, including uncomfortable facts. The second pass is asked to be sceptical and disciplined — to act as an editor whose only loyalty is to the source document. Splitting these responsibilities produces a more factual, more neutral result than asking a single step to do both at once, and it makes each step easy to inspect and adjust independently.</w:t>
+        <w:t xml:space="preserve">Separating drafting from review mirrors how good writing is actually produced, and it makes the system more controllable. The first pass is asked to be thorough and to surface everything, including uncomfortable facts. The second pass is asked to be sceptical and disciplined, acting as an editor whose only loyalty is to the source document. Splitting these responsibilities produces a more factual, more neutral result than asking a single step to do both at once, and it makes each step easy to inspect and adjust independently.</w:t>
       </w:r>
     </w:p>
     <w:p>
@@ -1163,7 +1163,7 @@
                 <w:sz w:val="22"/>
                 <w:szCs w:val="22"/>
               </w:rPr>
-              <w:t xml:space="preserve">A visual automation builder — boxes for each step, connected into a flow.</w:t>
+              <w:t xml:space="preserve">A visual automation builder: boxes for each step, connected into a flow.</w:t>
             </w:r>
           </w:p>
         </w:tc>
@@ -1716,7 +1716,7 @@
                 <w:sz w:val="22"/>
                 <w:szCs w:val="22"/>
               </w:rPr>
-              <w:t xml:space="preserve">No complicated installation — one command and it is running.</w:t>
+              <w:t xml:space="preserve">No complicated installation, one command and it is running.</w:t>
             </w:r>
           </w:p>
         </w:tc>
@@ -2283,7 +2283,7 @@
           <w:sz w:val="32"/>
           <w:szCs w:val="32"/>
         </w:rPr>
-        <w:t xml:space="preserve">6.  Conclusion</w:t>
+        <w:t xml:space="preserve">6.  The n8n Workflow in Detail</w:t>
       </w:r>
     </w:p>
     <w:p>
@@ -2297,7 +2297,24 @@
           <w:sz w:val="24"/>
           <w:szCs w:val="24"/>
         </w:rPr>
-        <w:t xml:space="preserve">The LP Reporting Assistant addresses a real, recurring, and costly task with a focused, human-supervised design. It reads the varied reports that portfolio companies actually send, extracts and verifies the figures that matter, flags what deserves attention, and assembles a branded quarterly report on the firm’s own template — all while leaving the final judgement, and the act of sending, firmly with a person.</w:t>
+        <w:t xml:space="preserve">Section 3 described the pipeline in business terms. This section walks through the actual automation, built in n8n, node by node. The workflow is organised into five stages, left to right, each marked with an on-canvas note so it reads like a diagram during a live walkthrough.</w:t>
+      </w:r>
+    </w:p>
+    <w:p>
+      <w:pPr>
+        <w:pStyle w:val="Heading2"/>
+        <w:spacing w:after="100" w:before="220"/>
+      </w:pPr>
+      <w:r>
+        <w:rPr>
+          <w:rFonts w:ascii="Garamond" w:cs="Garamond" w:eastAsia="Garamond" w:hAnsi="Garamond"/>
+          <w:b/>
+          <w:bCs/>
+          <w:color w:val="44546A"/>
+          <w:sz w:val="26"/>
+          <w:szCs w:val="26"/>
+        </w:rPr>
+        <w:t xml:space="preserve">Stage 1: Intake</w:t>
       </w:r>
     </w:p>
     <w:p>
@@ -2311,7 +2328,24 @@
           <w:sz w:val="24"/>
           <w:szCs w:val="24"/>
         </w:rPr>
-        <w:t xml:space="preserve">For an investor-relations or performance team, the value is straightforward: less time spent transcribing and formatting, more time spent verifying and thinking; greater consistency across companies and quarters; and fewer overlooked anomalies. For the firm, it is a demonstration that thoughtful, well-bounded automation can raise both the efficiency and the quality of a core investor obligation.</w:t>
+        <w:t xml:space="preserve">The workflow has two possible starting points. A manual trigger picks a PDF already sitting on disk, used for local testing. A webhook receives a PDF posted from the React frontend, which is the path used in the live demonstration. Both paths converge at a single step that converts the PDF into plain text, so every stage after it works with cheap, reliable text rather than an image.</w:t>
+      </w:r>
+    </w:p>
+    <w:p>
+      <w:pPr>
+        <w:pStyle w:val="Heading2"/>
+        <w:spacing w:after="100" w:before="220"/>
+      </w:pPr>
+      <w:r>
+        <w:rPr>
+          <w:rFonts w:ascii="Garamond" w:cs="Garamond" w:eastAsia="Garamond" w:hAnsi="Garamond"/>
+          <w:b/>
+          <w:bCs/>
+          <w:color w:val="44546A"/>
+          <w:sz w:val="26"/>
+          <w:szCs w:val="26"/>
+        </w:rPr>
+        <w:t xml:space="preserve">Stage 2: Metadata and two-step AI drafting</w:t>
       </w:r>
     </w:p>
     <w:p>
@@ -2325,7 +2359,194 @@
           <w:sz w:val="24"/>
           <w:szCs w:val="24"/>
         </w:rPr>
-        <w:t xml:space="preserve">The prototype is complete and functional today. The path forward is well understood and incremental: strengthen the governance and reliability, deepen the analytical capability, and integrate with the systems the firm already relies on. The foundation — turning raw, inconsistent inputs into a trustworthy, polished output — is already in place.</w:t>
+        <w:t xml:space="preserve">A parsing step reads the company name and reporting quarter straight out of the extracted text, with no manual data entry. The first Claude call then reads the full report and returns a structured result: a first-draft update paragraph, a key-metrics table, revenue and margin trends, the revenue-by-segment split, and a list of watch items worth an investor’s attention. The second Claude call acts purely as an editor on the narrative paragraph, removing speculation and promotional language, checking every claim against the source report, and tightening the tone. A final step turns the structured result into the chart URLs and text blocks the document itself needs.</w:t>
+      </w:r>
+    </w:p>
+    <w:p>
+      <w:pPr>
+        <w:pStyle w:val="Heading2"/>
+        <w:spacing w:after="100" w:before="220"/>
+      </w:pPr>
+      <w:r>
+        <w:rPr>
+          <w:rFonts w:ascii="Garamond" w:cs="Garamond" w:eastAsia="Garamond" w:hAnsi="Garamond"/>
+          <w:b/>
+          <w:bCs/>
+          <w:color w:val="44546A"/>
+          <w:sz w:val="26"/>
+          <w:szCs w:val="26"/>
+        </w:rPr>
+        <w:t xml:space="preserve">Stage 3: Drive folder structure</w:t>
+      </w:r>
+    </w:p>
+    <w:p>
+      <w:pPr>
+        <w:spacing w:after="160" w:line="300"/>
+        <w:jc w:val="both"/>
+      </w:pPr>
+      <w:r>
+        <w:rPr>
+          <w:rFonts w:ascii="Garamond" w:cs="Garamond" w:eastAsia="Garamond" w:hAnsi="Garamond"/>
+          <w:sz w:val="24"/>
+          <w:szCs w:val="24"/>
+        </w:rPr>
+        <w:t xml:space="preserve">This stage keeps every quarter’s output in one predictable place. The workflow looks for the top-level firm folder in Google Drive and creates it only if it does not yet exist, then repeats the same find-or-create pattern one level down for the dated quarter subfolder. Every company processed for a given quarter lands in the same subfolder automatically.</w:t>
+      </w:r>
+    </w:p>
+    <w:p>
+      <w:pPr>
+        <w:pStyle w:val="Heading2"/>
+        <w:spacing w:after="100" w:before="220"/>
+      </w:pPr>
+      <w:r>
+        <w:rPr>
+          <w:rFonts w:ascii="Garamond" w:cs="Garamond" w:eastAsia="Garamond" w:hAnsi="Garamond"/>
+          <w:b/>
+          <w:bCs/>
+          <w:color w:val="44546A"/>
+          <w:sz w:val="26"/>
+          <w:szCs w:val="26"/>
+        </w:rPr>
+        <w:t xml:space="preserve">Stage 4: Quarterly document lookup</w:t>
+      </w:r>
+    </w:p>
+    <w:p>
+      <w:pPr>
+        <w:spacing w:after="160" w:line="300"/>
+        <w:jc w:val="both"/>
+      </w:pPr>
+      <w:r>
+        <w:rPr>
+          <w:rFonts w:ascii="Garamond" w:cs="Garamond" w:eastAsia="Garamond" w:hAnsi="Garamond"/>
+          <w:sz w:val="24"/>
+          <w:szCs w:val="24"/>
+        </w:rPr>
+        <w:t xml:space="preserve">The workflow checks whether a Google Doc already exists for this quarter. If not, it is created by copying the firm’s real investor-report template, preserving the cover page and firm introduction exactly as designed. A branching step then decides which write path runs next, since a brand-new document needs its first company section written differently from a document that already contains other companies.</w:t>
+      </w:r>
+    </w:p>
+    <w:p>
+      <w:pPr>
+        <w:pStyle w:val="Heading2"/>
+        <w:spacing w:after="100" w:before="220"/>
+      </w:pPr>
+      <w:r>
+        <w:rPr>
+          <w:rFonts w:ascii="Garamond" w:cs="Garamond" w:eastAsia="Garamond" w:hAnsi="Garamond"/>
+          <w:b/>
+          <w:bCs/>
+          <w:color w:val="44546A"/>
+          <w:sz w:val="26"/>
+          <w:szCs w:val="26"/>
+        </w:rPr>
+        <w:t xml:space="preserve">Stage 5: Write, style, and output</w:t>
+      </w:r>
+    </w:p>
+    <w:p>
+      <w:pPr>
+        <w:spacing w:after="160" w:line="300"/>
+        <w:jc w:val="both"/>
+      </w:pPr>
+      <w:r>
+        <w:rPr>
+          <w:rFonts w:ascii="Garamond" w:cs="Garamond" w:eastAsia="Garamond" w:hAnsi="Garamond"/>
+          <w:sz w:val="24"/>
+          <w:szCs w:val="24"/>
+        </w:rPr>
+        <w:t xml:space="preserve">One path writes directly into a fresh template copy; the other inserts a page break and writes into a document that already has content. Both converge at a single point before styling begins. Styling runs in two passes, which proved necessary because filling text into one table shifts the character positions of every table that follows it in the document. The first pass writes plain text into every table cell only; the document is then re-fetched so every position is known and settled, and the second pass applies fonts, colours, bold formatting, and paragraph-style resets against that settled document. The final step returns the finished document link and the reviewed paragraph, which is also what the webhook sends back to the frontend.</w:t>
+      </w:r>
+    </w:p>
+    <w:p>
+      <w:pPr>
+        <w:pStyle w:val="Heading2"/>
+        <w:spacing w:after="100" w:before="220"/>
+      </w:pPr>
+      <w:r>
+        <w:rPr>
+          <w:rFonts w:ascii="Garamond" w:cs="Garamond" w:eastAsia="Garamond" w:hAnsi="Garamond"/>
+          <w:b/>
+          <w:bCs/>
+          <w:color w:val="44546A"/>
+          <w:sz w:val="26"/>
+          <w:szCs w:val="26"/>
+        </w:rPr>
+        <w:t xml:space="preserve">Why this structure was chosen</w:t>
+      </w:r>
+    </w:p>
+    <w:p>
+      <w:pPr>
+        <w:spacing w:after="160" w:line="300"/>
+        <w:jc w:val="both"/>
+      </w:pPr>
+      <w:r>
+        <w:rPr>
+          <w:rFonts w:ascii="Garamond" w:cs="Garamond" w:eastAsia="Garamond" w:hAnsi="Garamond"/>
+          <w:sz w:val="24"/>
+          <w:szCs w:val="24"/>
+        </w:rPr>
+        <w:t xml:space="preserve">Building the pipeline as a visual, node-by-node flow rather than a single opaque script keeps every step inspectable and independently adjustable: a reviewer can open the workflow, see exactly what each stage does, and trace precisely how a given number or sentence in the final document was produced. The two-pass styling approach and the find-or-create folder pattern are both examples of a broader principle followed throughout: prefer an explicit, visible extra step over a fragile shortcut.</w:t>
+      </w:r>
+    </w:p>
+    <w:p>
+      <w:pPr>
+        <w:pStyle w:val="Heading1"/>
+        <w:pageBreakBefore/>
+        <w:pBdr>
+          <w:bottom w:val="single" w:color="0F3854" w:sz="8" w:space="4"/>
+        </w:pBdr>
+        <w:spacing w:after="160" w:before="320"/>
+      </w:pPr>
+      <w:r>
+        <w:rPr>
+          <w:rFonts w:ascii="Garamond" w:cs="Garamond" w:eastAsia="Garamond" w:hAnsi="Garamond"/>
+          <w:b/>
+          <w:bCs/>
+          <w:color w:val="0F3854"/>
+          <w:sz w:val="32"/>
+          <w:szCs w:val="32"/>
+        </w:rPr>
+        <w:t xml:space="preserve">7.  Conclusion</w:t>
+      </w:r>
+    </w:p>
+    <w:p>
+      <w:pPr>
+        <w:spacing w:after="160" w:line="300"/>
+        <w:jc w:val="both"/>
+      </w:pPr>
+      <w:r>
+        <w:rPr>
+          <w:rFonts w:ascii="Garamond" w:cs="Garamond" w:eastAsia="Garamond" w:hAnsi="Garamond"/>
+          <w:sz w:val="24"/>
+          <w:szCs w:val="24"/>
+        </w:rPr>
+        <w:t xml:space="preserve">The LP Reporting Assistant addresses a real, recurring, and costly task with a focused, human-supervised design. It reads the varied reports that portfolio companies actually send, extracts and verifies the figures that matter, flags what deserves attention, and assembles a branded quarterly report on the firm’s own template, all while leaving the final judgement, and the act of sending, firmly with a person.</w:t>
+      </w:r>
+    </w:p>
+    <w:p>
+      <w:pPr>
+        <w:spacing w:after="160" w:line="300"/>
+        <w:jc w:val="both"/>
+      </w:pPr>
+      <w:r>
+        <w:rPr>
+          <w:rFonts w:ascii="Garamond" w:cs="Garamond" w:eastAsia="Garamond" w:hAnsi="Garamond"/>
+          <w:sz w:val="24"/>
+          <w:szCs w:val="24"/>
+        </w:rPr>
+        <w:t xml:space="preserve">For an investor-relations or performance team, the value is straightforward: less time spent transcribing and formatting, more time spent verifying and thinking; greater consistency across companies and quarters; and fewer overlooked anomalies. For the firm, it is a demonstration that thoughtful, well-bounded automation can raise both the efficiency and the quality of a core investor obligation.</w:t>
+      </w:r>
+    </w:p>
+    <w:p>
+      <w:pPr>
+        <w:spacing w:after="160" w:line="300"/>
+        <w:jc w:val="both"/>
+      </w:pPr>
+      <w:r>
+        <w:rPr>
+          <w:rFonts w:ascii="Garamond" w:cs="Garamond" w:eastAsia="Garamond" w:hAnsi="Garamond"/>
+          <w:sz w:val="24"/>
+          <w:szCs w:val="24"/>
+        </w:rPr>
+        <w:t xml:space="preserve">The prototype is complete and functional today. The path forward is well understood and incremental: strengthen the governance and reliability, deepen the analytical capability, and integrate with the systems the firm already relies on. The foundation, turning raw, inconsistent inputs into a trustworthy, polished output, is already in place.</w:t>
       </w:r>
     </w:p>
     <w:p>

</xml_diff>